<commit_message>
Deploy preview for PR 42 🛫
</commit_message>
<xml_diff>
--- a/pr-preview/pr-42/Your-Book-Title-tracked-changes.docx
+++ b/pr-preview/pr-42/Your-Book-Title-tracked-changes.docx
@@ -2278,7 +2278,7 @@
       </w:ins>
       <w:ins w:id="80" w:author="PR Preview" w:date="2024-01-01T00:00:00Z">
         <w:r>
-          <w:t xml:space="preserve">509ead2</w:t>
+          <w:t xml:space="preserve">cc9fd3d</w:t>
         </w:r>
       </w:ins>
     </w:p>
@@ -2306,7 +2306,7 @@
       </w:ins>
       <w:ins w:id="81" w:author="PR Preview" w:date="2024-01-01T00:00:00Z">
         <w:r>
-          <w:t xml:space="preserve">509ead278ae43df1013cd064a55aaa420447ee74</w:t>
+          <w:t xml:space="preserve">cc9fd3d46585e2f5dd04a653d3ab7e0316c780e1</w:t>
         </w:r>
       </w:ins>
     </w:p>
@@ -2334,7 +2334,7 @@
       </w:ins>
       <w:ins w:id="82" w:author="PR Preview" w:date="2024-01-01T00:00:00Z">
         <w:r>
-          <w:t xml:space="preserve">2026-05-26 19:08:27 -0700</w:t>
+          <w:t xml:space="preserve">2026-05-27 04:05:47 +0000</w:t>
         </w:r>
       </w:ins>
     </w:p>

</xml_diff>